<commit_message>
docs: sync and update all project files and capstone report
</commit_message>
<xml_diff>
--- a/week5/Week5_Comprehensive_Project_Report.docx
+++ b/week5/Week5_Comprehensive_Project_Report.docx
@@ -1,6 +1,6 @@
 
 <file path=word/document.xml><?xml version="1.0" encoding="utf-8"?>
-<w:document xmlns:wpc="http://schemas.microsoft.com/office/word/2010/wordprocessingCanvas" xmlns:mo="http://schemas.microsoft.com/office/mac/office/2008/main" xmlns:mc="http://schemas.openxmlformats.org/markup-compatibility/2006" xmlns:mv="urn:schemas-microsoft-com:mac:vml" xmlns:o="urn:schemas-microsoft-com:office:office" xmlns:r="http://schemas.openxmlformats.org/officeDocument/2006/relationships" xmlns:m="http://schemas.openxmlformats.org/officeDocument/2006/math" xmlns:v="urn:schemas-microsoft-com:vml" xmlns:wp14="http://schemas.microsoft.com/office/word/2010/wordprocessingDrawing" xmlns:wp="http://schemas.openxmlformats.org/drawingml/2006/wordprocessingDrawing" xmlns:w10="urn:schemas-microsoft-com:office:word" xmlns:w="http://schemas.openxmlformats.org/wordprocessingml/2006/main" xmlns:w14="http://schemas.microsoft.com/office/word/2010/wordml" xmlns:wpg="http://schemas.microsoft.com/office/word/2010/wordprocessingGroup" xmlns:wpi="http://schemas.microsoft.com/office/word/2010/wordprocessingInk" xmlns:wne="http://schemas.microsoft.com/office/word/2006/wordml" xmlns:wps="http://schemas.microsoft.com/office/word/2010/wordprocessingShape" mc:Ignorable="w14 wp14">
+<w:document xmlns:ve="http://schemas.openxmlformats.org/markup-compatibility/2006" xmlns:o="urn:schemas-microsoft-com:office:office" xmlns:r="http://schemas.openxmlformats.org/officeDocument/2006/relationships" xmlns:m="http://schemas.openxmlformats.org/officeDocument/2006/math" xmlns:v="urn:schemas-microsoft-com:vml" xmlns:wp="http://schemas.openxmlformats.org/drawingml/2006/wordprocessingDrawing" xmlns:w10="urn:schemas-microsoft-com:office:word" xmlns:w="http://schemas.openxmlformats.org/wordprocessingml/2006/main" xmlns:wne="http://schemas.microsoft.com/office/word/2006/wordml">
   <w:body>
     <w:p>
       <w:pPr>
@@ -13,6 +13,13 @@
           <w:sz w:val="40"/>
         </w:rPr>
         <w:t>WEEK 5: CAPSTONE PROJECT REPORT</w:t>
+      </w:r>
+      <w:r>
+        <w:rPr>
+          <w:b/>
+          <w:color w:val="1A5276"/>
+          <w:sz w:val="40"/>
+        </w:rPr>
         <w:br/>
       </w:r>
       <w:r>
@@ -22,6 +29,13 @@
           <w:sz w:val="26"/>
         </w:rPr>
         <w:t>Comprehensive Data Science Project Reporting &amp; Strategic Policy Recommendations</w:t>
+      </w:r>
+      <w:r>
+        <w:rPr>
+          <w:i/>
+          <w:color w:val="2874A6"/>
+          <w:sz w:val="26"/>
+        </w:rPr>
         <w:br/>
       </w:r>
       <w:r>
@@ -30,43 +44,13 @@
           <w:sz w:val="21"/>
         </w:rPr>
         <w:t>A Data-Driven Global Well-Being Investigation based on the World Happiness Report (2015–2022)</w:t>
-        <w:br/>
       </w:r>
       <w:r>
         <w:rPr>
-          <w:color w:val="808080"/>
-          <w:sz w:val="19"/>
+          <w:color w:val="2C3E50"/>
+          <w:sz w:val="21"/>
         </w:rPr>
-        <w:t>YUVA Data Analytics Internship | Final Capstone Deliverable</w:t>
-      </w:r>
-    </w:p>
-    <w:p>
-      <w:pPr>
-        <w:spacing w:after="160"/>
-      </w:pPr>
-    </w:p>
-    <w:p>
-      <w:pPr>
-        <w:pStyle w:val="Heading1"/>
-        <w:spacing w:before="280" w:after="80"/>
-      </w:pPr>
-      <w:r>
-        <w:rPr>
-          <w:b/>
-          <w:color w:val="1A5276"/>
-          <w:sz w:val="30"/>
-        </w:rPr>
-        <w:t>1. Executive Summary</w:t>
-      </w:r>
-    </w:p>
-    <w:p>
-      <w:r>
-        <w:t>This comprehensive capstone report synthesizes the 5-week data science investigation into global subjective well-being, leveraging the multi-year World Happiness Report dataset. By integrating exploratory data analysis, visual storytelling, parametric statistical hypothesis testing, and supervised machine learning pipelines, this project establishes a rigorous, evidence-based framework identifying the primary drivers of national happiness.</w:t>
-      </w:r>
-    </w:p>
-    <w:p>
-      <w:r>
-        <w:t>Key Findings: While economic output (GDP per capita) and healthy life expectancy establish the foundational prerequisite for subjective well-being (explaining over 70% of variance), social support networks (Family) and institutional trust (absence of corruption) serve as vital non-linear multipliers that differentiate top-tier thriving societies from stagnant economies. Predictive machine learning models achieved high out-of-sample accuracy (R² = 0.866; Classification AUC = 0.939), providing reliable quantitative tools for scenario simulation and targeted policy intervention.</w:t>
+        <w:br/>
       </w:r>
     </w:p>
     <w:p>
@@ -76,7 +60,41 @@
       </w:pPr>
       <w:r>
         <w:rPr>
-          <w:b/>
+          <w:color w:val="1A5276"/>
+          <w:sz w:val="30"/>
+        </w:rPr>
+        <w:t>1. Executive Summary</w:t>
+      </w:r>
+    </w:p>
+    <w:p>
+      <w:r>
+        <w:t>This comprehensive capstone report synthesizes the 5-week data science investigation into global subjective well-being, leveraging the multi-year World Happiness Report dataset. By integrating exploratory data analysis, vi</w:t>
+      </w:r>
+      <w:r>
+        <w:t>sual storytelling, parametric statistical hypothesis testing, and supervised machine learning pipelines, this project establishes a rigorous, evidence-based framework identifying the primary drivers of national happiness.</w:t>
+      </w:r>
+    </w:p>
+    <w:p>
+      <w:r>
+        <w:t>Key Findings: While economic outpu</w:t>
+      </w:r>
+      <w:r>
+        <w:t>t (GDP per capita) and healthy life expectancy establish the foundational prerequisite for subjective well-being (explaining over 70% of variance), social support networks (Family) and institutional trust (absence of corruption) serve as vital non-linear m</w:t>
+      </w:r>
+      <w:r>
+        <w:t>ultipliers that differentiate top-tier thriving societies from stagnant economies. Predictive machine learning models achieved high out-of-sample accuracy (R² = 0.866; Classification AUC = 0.939), providing reliable quantitative tools for scenario simulati</w:t>
+      </w:r>
+      <w:r>
+        <w:t>on and targeted policy intervention.</w:t>
+      </w:r>
+    </w:p>
+    <w:p>
+      <w:pPr>
+        <w:pStyle w:val="Heading1"/>
+        <w:spacing w:before="280" w:after="80"/>
+      </w:pPr>
+      <w:r>
+        <w:rPr>
           <w:color w:val="1A5276"/>
           <w:sz w:val="30"/>
         </w:rPr>
@@ -99,7 +117,13 @@
         <w:t xml:space="preserve">Phase 1: Data Acquisition &amp; Preprocessing (Week 1): </w:t>
       </w:r>
       <w:r>
-        <w:t>Extracted and profiled 1,231 multi-year country records. Diagnosed concatenation schema gaps in 2017–2022 and restricted modeling to 315 complete, verified observations across six core socio-economic dimensions while eliminating target-leaking features (Happiness Rank, Dystopia Residual).</w:t>
+        <w:t>Extracted and profi</w:t>
+      </w:r>
+      <w:r>
+        <w:t>led 1,231 multi-year country records. Diagnosed concatenation schema gaps in 2017–2022 and restricted modeling to 315 complete, verified observations across six core socio-economic dimensions while eliminating target-leaking features (Happiness Rank, Dysto</w:t>
+      </w:r>
+      <w:r>
+        <w:t>pia Residual).</w:t>
       </w:r>
     </w:p>
     <w:p>
@@ -124,10 +148,19 @@
         <w:rPr>
           <w:b/>
         </w:rPr>
-        <w:t xml:space="preserve">Phase 3: Statistical Hypothesis Testing (Week 3): </w:t>
+        <w:t xml:space="preserve">Phase </w:t>
       </w:r>
       <w:r>
-        <w:t>Formulated and executed two-sample independent t-tests and correlation significance tests (t = 16.84, p &lt; 0.0001), formally rejecting the null hypothesis to prove that high-GDP nations experience statistically superior happiness.</w:t>
+        <w:rPr>
+          <w:b/>
+        </w:rPr>
+        <w:t xml:space="preserve">3: Statistical Hypothesis Testing (Week 3): </w:t>
+      </w:r>
+      <w:r>
+        <w:t>Formulated and executed two-sample independent t-tests and correlation significance tests (t = 16.84, p &lt; 0.0001), formally rejecting the null hypothesis to prove that high-GDP nations experience statistically su</w:t>
+      </w:r>
+      <w:r>
+        <w:t>perior happiness.</w:t>
       </w:r>
     </w:p>
     <w:p>
@@ -141,8 +174,21 @@
         <w:t xml:space="preserve">Phase 4: Predictive Machine Learning &amp; Diagnostics (Week 4): </w:t>
       </w:r>
       <w:r>
-        <w:t>Trained, validated, and compared five regression and classification architectures (Linear, Ridge L2, Decision Trees, Random Forest, Gradient Boosting) using 5-Fold Cross-Validation and residual error diagnostics.</w:t>
+        <w:t>Trained, validated, and compared five regression and classification architectures (Linear, Ridge L2, Decision Trees, Random Forest, Gradient Boosting) using 5-Fold Cross-Validat</w:t>
       </w:r>
+      <w:r>
+        <w:t>ion and residual error diagnostics.</w:t>
+      </w:r>
+    </w:p>
+    <w:p>
+      <w:pPr>
+        <w:pStyle w:val="ListBullet"/>
+        <w:numPr>
+          <w:ilvl w:val="0"/>
+          <w:numId w:val="0"/>
+        </w:numPr>
+        <w:ind w:left="360"/>
+      </w:pPr>
     </w:p>
     <w:p>
       <w:pPr>
@@ -151,10 +197,10 @@
       </w:pPr>
       <w:r>
         <w:rPr>
-          <w:b/>
           <w:color w:val="1A5276"/>
           <w:sz w:val="30"/>
         </w:rPr>
+        <w:lastRenderedPageBreak/>
         <w:t>3. Synthesis of Technical &amp; Empirical Results</w:t>
       </w:r>
     </w:p>
@@ -166,11 +212,10 @@
     <w:p>
       <w:pPr>
         <w:pStyle w:val="Heading2"/>
-        <w:spacing w:before="200" w:after="60"/>
+        <w:spacing w:after="60"/>
       </w:pPr>
       <w:r>
         <w:rPr>
-          <w:b/>
           <w:color w:val="2874A6"/>
           <w:sz w:val="24"/>
         </w:rPr>
@@ -179,9 +224,9 @@
     </w:p>
     <w:tbl>
       <w:tblPr>
-        <w:tblW w:type="auto" w:w="0"/>
+        <w:tblW w:w="0" w:type="auto"/>
         <w:jc w:val="center"/>
-        <w:tblLook w:firstColumn="1" w:firstRow="1" w:lastColumn="0" w:lastRow="0" w:noHBand="0" w:noVBand="1" w:val="04A0"/>
+        <w:tblLook w:val="04A0"/>
       </w:tblPr>
       <w:tblGrid>
         <w:gridCol w:w="1560"/>
@@ -192,10 +237,13 @@
         <w:gridCol w:w="1560"/>
       </w:tblGrid>
       <w:tr>
+        <w:trPr>
+          <w:jc w:val="center"/>
+        </w:trPr>
         <w:tc>
           <w:tcPr>
-            <w:tcW w:type="dxa" w:w="1560"/>
-            <w:shd w:fill="1A5276"/>
+            <w:tcW w:w="1560" w:type="dxa"/>
+            <w:shd w:val="clear" w:color="auto" w:fill="1A5276"/>
           </w:tcPr>
           <w:p>
             <w:pPr>
@@ -213,8 +261,8 @@
         </w:tc>
         <w:tc>
           <w:tcPr>
-            <w:tcW w:type="dxa" w:w="1560"/>
-            <w:shd w:fill="1A5276"/>
+            <w:tcW w:w="1560" w:type="dxa"/>
+            <w:shd w:val="clear" w:color="auto" w:fill="1A5276"/>
           </w:tcPr>
           <w:p>
             <w:pPr>
@@ -232,8 +280,8 @@
         </w:tc>
         <w:tc>
           <w:tcPr>
-            <w:tcW w:type="dxa" w:w="1560"/>
-            <w:shd w:fill="1A5276"/>
+            <w:tcW w:w="1560" w:type="dxa"/>
+            <w:shd w:val="clear" w:color="auto" w:fill="1A5276"/>
           </w:tcPr>
           <w:p>
             <w:pPr>
@@ -251,8 +299,8 @@
         </w:tc>
         <w:tc>
           <w:tcPr>
-            <w:tcW w:type="dxa" w:w="1560"/>
-            <w:shd w:fill="1A5276"/>
+            <w:tcW w:w="1560" w:type="dxa"/>
+            <w:shd w:val="clear" w:color="auto" w:fill="1A5276"/>
           </w:tcPr>
           <w:p>
             <w:pPr>
@@ -270,8 +318,8 @@
         </w:tc>
         <w:tc>
           <w:tcPr>
-            <w:tcW w:type="dxa" w:w="1560"/>
-            <w:shd w:fill="1A5276"/>
+            <w:tcW w:w="1560" w:type="dxa"/>
+            <w:shd w:val="clear" w:color="auto" w:fill="1A5276"/>
           </w:tcPr>
           <w:p>
             <w:pPr>
@@ -283,14 +331,22 @@
                 <w:color w:val="FFFFFF"/>
                 <w:sz w:val="17"/>
               </w:rPr>
-              <w:t>5-Fold CV R² / AUC</w:t>
+              <w:t>5-</w:t>
+            </w:r>
+            <w:r>
+              <w:rPr>
+                <w:b/>
+                <w:color w:val="FFFFFF"/>
+                <w:sz w:val="17"/>
+              </w:rPr>
+              <w:t>Fold CV R² / AUC</w:t>
             </w:r>
           </w:p>
         </w:tc>
         <w:tc>
           <w:tcPr>
-            <w:tcW w:type="dxa" w:w="1560"/>
-            <w:shd w:fill="1A5276"/>
+            <w:tcW w:w="1560" w:type="dxa"/>
+            <w:shd w:val="clear" w:color="auto" w:fill="1A5276"/>
           </w:tcPr>
           <w:p>
             <w:pPr>
@@ -308,10 +364,13 @@
         </w:tc>
       </w:tr>
       <w:tr>
+        <w:trPr>
+          <w:jc w:val="center"/>
+        </w:trPr>
         <w:tc>
           <w:tcPr>
-            <w:tcW w:type="dxa" w:w="1560"/>
-            <w:shd w:fill="F2F4F4"/>
+            <w:tcW w:w="1560" w:type="dxa"/>
+            <w:shd w:val="clear" w:color="auto" w:fill="F2F4F4"/>
           </w:tcPr>
           <w:p>
             <w:pPr>
@@ -327,8 +386,8 @@
         </w:tc>
         <w:tc>
           <w:tcPr>
-            <w:tcW w:type="dxa" w:w="1560"/>
-            <w:shd w:fill="F2F4F4"/>
+            <w:tcW w:w="1560" w:type="dxa"/>
+            <w:shd w:val="clear" w:color="auto" w:fill="F2F4F4"/>
           </w:tcPr>
           <w:p>
             <w:pPr>
@@ -344,8 +403,8 @@
         </w:tc>
         <w:tc>
           <w:tcPr>
-            <w:tcW w:type="dxa" w:w="1560"/>
-            <w:shd w:fill="F2F4F4"/>
+            <w:tcW w:w="1560" w:type="dxa"/>
+            <w:shd w:val="clear" w:color="auto" w:fill="F2F4F4"/>
           </w:tcPr>
           <w:p>
             <w:pPr>
@@ -361,8 +420,8 @@
         </w:tc>
         <w:tc>
           <w:tcPr>
-            <w:tcW w:type="dxa" w:w="1560"/>
-            <w:shd w:fill="F2F4F4"/>
+            <w:tcW w:w="1560" w:type="dxa"/>
+            <w:shd w:val="clear" w:color="auto" w:fill="F2F4F4"/>
           </w:tcPr>
           <w:p>
             <w:pPr>
@@ -378,8 +437,8 @@
         </w:tc>
         <w:tc>
           <w:tcPr>
-            <w:tcW w:type="dxa" w:w="1560"/>
-            <w:shd w:fill="F2F4F4"/>
+            <w:tcW w:w="1560" w:type="dxa"/>
+            <w:shd w:val="clear" w:color="auto" w:fill="F2F4F4"/>
           </w:tcPr>
           <w:p>
             <w:pPr>
@@ -395,8 +454,8 @@
         </w:tc>
         <w:tc>
           <w:tcPr>
-            <w:tcW w:type="dxa" w:w="1560"/>
-            <w:shd w:fill="F2F4F4"/>
+            <w:tcW w:w="1560" w:type="dxa"/>
+            <w:shd w:val="clear" w:color="auto" w:fill="F2F4F4"/>
           </w:tcPr>
           <w:p>
             <w:pPr>
@@ -412,9 +471,12 @@
         </w:tc>
       </w:tr>
       <w:tr>
+        <w:trPr>
+          <w:jc w:val="center"/>
+        </w:trPr>
         <w:tc>
           <w:tcPr>
-            <w:tcW w:type="dxa" w:w="1560"/>
+            <w:tcW w:w="1560" w:type="dxa"/>
           </w:tcPr>
           <w:p>
             <w:pPr>
@@ -430,7 +492,7 @@
         </w:tc>
         <w:tc>
           <w:tcPr>
-            <w:tcW w:type="dxa" w:w="1560"/>
+            <w:tcW w:w="1560" w:type="dxa"/>
           </w:tcPr>
           <w:p>
             <w:pPr>
@@ -446,7 +508,7 @@
         </w:tc>
         <w:tc>
           <w:tcPr>
-            <w:tcW w:type="dxa" w:w="1560"/>
+            <w:tcW w:w="1560" w:type="dxa"/>
           </w:tcPr>
           <w:p>
             <w:pPr>
@@ -462,7 +524,7 @@
         </w:tc>
         <w:tc>
           <w:tcPr>
-            <w:tcW w:type="dxa" w:w="1560"/>
+            <w:tcW w:w="1560" w:type="dxa"/>
           </w:tcPr>
           <w:p>
             <w:pPr>
@@ -478,7 +540,7 @@
         </w:tc>
         <w:tc>
           <w:tcPr>
-            <w:tcW w:type="dxa" w:w="1560"/>
+            <w:tcW w:w="1560" w:type="dxa"/>
           </w:tcPr>
           <w:p>
             <w:pPr>
@@ -494,7 +556,7 @@
         </w:tc>
         <w:tc>
           <w:tcPr>
-            <w:tcW w:type="dxa" w:w="1560"/>
+            <w:tcW w:w="1560" w:type="dxa"/>
           </w:tcPr>
           <w:p>
             <w:pPr>
@@ -510,10 +572,13 @@
         </w:tc>
       </w:tr>
       <w:tr>
+        <w:trPr>
+          <w:jc w:val="center"/>
+        </w:trPr>
         <w:tc>
           <w:tcPr>
-            <w:tcW w:type="dxa" w:w="1560"/>
-            <w:shd w:fill="F2F4F4"/>
+            <w:tcW w:w="1560" w:type="dxa"/>
+            <w:shd w:val="clear" w:color="auto" w:fill="F2F4F4"/>
           </w:tcPr>
           <w:p>
             <w:pPr>
@@ -529,8 +594,8 @@
         </w:tc>
         <w:tc>
           <w:tcPr>
-            <w:tcW w:type="dxa" w:w="1560"/>
-            <w:shd w:fill="F2F4F4"/>
+            <w:tcW w:w="1560" w:type="dxa"/>
+            <w:shd w:val="clear" w:color="auto" w:fill="F2F4F4"/>
           </w:tcPr>
           <w:p>
             <w:pPr>
@@ -546,8 +611,8 @@
         </w:tc>
         <w:tc>
           <w:tcPr>
-            <w:tcW w:type="dxa" w:w="1560"/>
-            <w:shd w:fill="F2F4F4"/>
+            <w:tcW w:w="1560" w:type="dxa"/>
+            <w:shd w:val="clear" w:color="auto" w:fill="F2F4F4"/>
           </w:tcPr>
           <w:p>
             <w:pPr>
@@ -563,8 +628,8 @@
         </w:tc>
         <w:tc>
           <w:tcPr>
-            <w:tcW w:type="dxa" w:w="1560"/>
-            <w:shd w:fill="F2F4F4"/>
+            <w:tcW w:w="1560" w:type="dxa"/>
+            <w:shd w:val="clear" w:color="auto" w:fill="F2F4F4"/>
           </w:tcPr>
           <w:p>
             <w:pPr>
@@ -580,8 +645,8 @@
         </w:tc>
         <w:tc>
           <w:tcPr>
-            <w:tcW w:type="dxa" w:w="1560"/>
-            <w:shd w:fill="F2F4F4"/>
+            <w:tcW w:w="1560" w:type="dxa"/>
+            <w:shd w:val="clear" w:color="auto" w:fill="F2F4F4"/>
           </w:tcPr>
           <w:p>
             <w:pPr>
@@ -597,8 +662,8 @@
         </w:tc>
         <w:tc>
           <w:tcPr>
-            <w:tcW w:type="dxa" w:w="1560"/>
-            <w:shd w:fill="F2F4F4"/>
+            <w:tcW w:w="1560" w:type="dxa"/>
+            <w:shd w:val="clear" w:color="auto" w:fill="F2F4F4"/>
           </w:tcPr>
           <w:p>
             <w:pPr>
@@ -614,9 +679,12 @@
         </w:tc>
       </w:tr>
       <w:tr>
+        <w:trPr>
+          <w:jc w:val="center"/>
+        </w:trPr>
         <w:tc>
           <w:tcPr>
-            <w:tcW w:type="dxa" w:w="1560"/>
+            <w:tcW w:w="1560" w:type="dxa"/>
           </w:tcPr>
           <w:p>
             <w:pPr>
@@ -632,7 +700,7 @@
         </w:tc>
         <w:tc>
           <w:tcPr>
-            <w:tcW w:type="dxa" w:w="1560"/>
+            <w:tcW w:w="1560" w:type="dxa"/>
           </w:tcPr>
           <w:p>
             <w:pPr>
@@ -648,7 +716,7 @@
         </w:tc>
         <w:tc>
           <w:tcPr>
-            <w:tcW w:type="dxa" w:w="1560"/>
+            <w:tcW w:w="1560" w:type="dxa"/>
           </w:tcPr>
           <w:p>
             <w:pPr>
@@ -664,7 +732,7 @@
         </w:tc>
         <w:tc>
           <w:tcPr>
-            <w:tcW w:type="dxa" w:w="1560"/>
+            <w:tcW w:w="1560" w:type="dxa"/>
           </w:tcPr>
           <w:p>
             <w:pPr>
@@ -680,7 +748,7 @@
         </w:tc>
         <w:tc>
           <w:tcPr>
-            <w:tcW w:type="dxa" w:w="1560"/>
+            <w:tcW w:w="1560" w:type="dxa"/>
           </w:tcPr>
           <w:p>
             <w:pPr>
@@ -696,7 +764,7 @@
         </w:tc>
         <w:tc>
           <w:tcPr>
-            <w:tcW w:type="dxa" w:w="1560"/>
+            <w:tcW w:w="1560" w:type="dxa"/>
           </w:tcPr>
           <w:p>
             <w:pPr>
@@ -712,10 +780,13 @@
         </w:tc>
       </w:tr>
       <w:tr>
+        <w:trPr>
+          <w:jc w:val="center"/>
+        </w:trPr>
         <w:tc>
           <w:tcPr>
-            <w:tcW w:type="dxa" w:w="1560"/>
-            <w:shd w:fill="F2F4F4"/>
+            <w:tcW w:w="1560" w:type="dxa"/>
+            <w:shd w:val="clear" w:color="auto" w:fill="F2F4F4"/>
           </w:tcPr>
           <w:p>
             <w:pPr>
@@ -731,8 +802,8 @@
         </w:tc>
         <w:tc>
           <w:tcPr>
-            <w:tcW w:type="dxa" w:w="1560"/>
-            <w:shd w:fill="F2F4F4"/>
+            <w:tcW w:w="1560" w:type="dxa"/>
+            <w:shd w:val="clear" w:color="auto" w:fill="F2F4F4"/>
           </w:tcPr>
           <w:p>
             <w:pPr>
@@ -748,8 +819,8 @@
         </w:tc>
         <w:tc>
           <w:tcPr>
-            <w:tcW w:type="dxa" w:w="1560"/>
-            <w:shd w:fill="F2F4F4"/>
+            <w:tcW w:w="1560" w:type="dxa"/>
+            <w:shd w:val="clear" w:color="auto" w:fill="F2F4F4"/>
           </w:tcPr>
           <w:p>
             <w:pPr>
@@ -765,8 +836,8 @@
         </w:tc>
         <w:tc>
           <w:tcPr>
-            <w:tcW w:type="dxa" w:w="1560"/>
-            <w:shd w:fill="F2F4F4"/>
+            <w:tcW w:w="1560" w:type="dxa"/>
+            <w:shd w:val="clear" w:color="auto" w:fill="F2F4F4"/>
           </w:tcPr>
           <w:p>
             <w:pPr>
@@ -782,8 +853,8 @@
         </w:tc>
         <w:tc>
           <w:tcPr>
-            <w:tcW w:type="dxa" w:w="1560"/>
-            <w:shd w:fill="F2F4F4"/>
+            <w:tcW w:w="1560" w:type="dxa"/>
+            <w:shd w:val="clear" w:color="auto" w:fill="F2F4F4"/>
           </w:tcPr>
           <w:p>
             <w:pPr>
@@ -799,8 +870,8 @@
         </w:tc>
         <w:tc>
           <w:tcPr>
-            <w:tcW w:type="dxa" w:w="1560"/>
-            <w:shd w:fill="F2F4F4"/>
+            <w:tcW w:w="1560" w:type="dxa"/>
+            <w:shd w:val="clear" w:color="auto" w:fill="F2F4F4"/>
           </w:tcPr>
           <w:p>
             <w:pPr>
@@ -810,7 +881,13 @@
               <w:rPr>
                 <w:sz w:val="17"/>
               </w:rPr>
-              <w:t>High variance; prone to leaf overfitting</w:t>
+              <w:t xml:space="preserve">High variance; prone </w:t>
+            </w:r>
+            <w:r>
+              <w:rPr>
+                <w:sz w:val="17"/>
+              </w:rPr>
+              <w:t>to leaf overfitting</w:t>
             </w:r>
           </w:p>
         </w:tc>
@@ -828,31 +905,35 @@
       </w:pPr>
       <w:r>
         <w:rPr>
-          <w:b/>
           <w:color w:val="1A5276"/>
           <w:sz w:val="30"/>
         </w:rPr>
+        <w:lastRenderedPageBreak/>
         <w:t>4. Visual Analytics &amp; Evidence</w:t>
       </w:r>
     </w:p>
     <w:p>
       <w:r>
+        <w:rPr>
+          <w:noProof/>
+        </w:rPr>
         <w:drawing>
-          <wp:inline xmlns:a="http://schemas.openxmlformats.org/drawingml/2006/main" xmlns:pic="http://schemas.openxmlformats.org/drawingml/2006/picture">
+          <wp:inline distT="0" distB="0" distL="0" distR="0">
             <wp:extent cx="5029200" cy="3719823"/>
+            <wp:effectExtent l="0" t="0" r="0" b="0"/>
             <wp:docPr id="1" name="Picture 1"/>
             <wp:cNvGraphicFramePr>
-              <a:graphicFrameLocks noChangeAspect="1"/>
+              <a:graphicFrameLocks xmlns:a="http://schemas.openxmlformats.org/drawingml/2006/main" noChangeAspect="1"/>
             </wp:cNvGraphicFramePr>
-            <a:graphic>
+            <a:graphic xmlns:a="http://schemas.openxmlformats.org/drawingml/2006/main">
               <a:graphicData uri="http://schemas.openxmlformats.org/drawingml/2006/picture">
-                <pic:pic>
+                <pic:pic xmlns:pic="http://schemas.openxmlformats.org/drawingml/2006/picture">
                   <pic:nvPicPr>
                     <pic:cNvPr id="0" name="viz1_region_distribution.png"/>
                     <pic:cNvPicPr/>
                   </pic:nvPicPr>
                   <pic:blipFill>
-                    <a:blip r:embed="rId9"/>
+                    <a:blip r:embed="rId6"/>
                     <a:stretch>
                       <a:fillRect/>
                     </a:stretch>
@@ -862,7 +943,9 @@
                       <a:off x="0" y="0"/>
                       <a:ext cx="5029200" cy="3719823"/>
                     </a:xfrm>
-                    <a:prstGeom prst="rect"/>
+                    <a:prstGeom prst="rect">
+                      <a:avLst/>
+                    </a:prstGeom>
                   </pic:spPr>
                 </pic:pic>
               </a:graphicData>
@@ -885,22 +968,26 @@
     </w:p>
     <w:p>
       <w:r>
+        <w:rPr>
+          <w:noProof/>
+        </w:rPr>
         <w:drawing>
-          <wp:inline xmlns:a="http://schemas.openxmlformats.org/drawingml/2006/main" xmlns:pic="http://schemas.openxmlformats.org/drawingml/2006/picture">
+          <wp:inline distT="0" distB="0" distL="0" distR="0">
             <wp:extent cx="5029200" cy="2794000"/>
+            <wp:effectExtent l="0" t="0" r="0" b="0"/>
             <wp:docPr id="2" name="Picture 2"/>
             <wp:cNvGraphicFramePr>
-              <a:graphicFrameLocks noChangeAspect="1"/>
+              <a:graphicFrameLocks xmlns:a="http://schemas.openxmlformats.org/drawingml/2006/main" noChangeAspect="1"/>
             </wp:cNvGraphicFramePr>
-            <a:graphic>
+            <a:graphic xmlns:a="http://schemas.openxmlformats.org/drawingml/2006/main">
               <a:graphicData uri="http://schemas.openxmlformats.org/drawingml/2006/picture">
-                <pic:pic>
+                <pic:pic xmlns:pic="http://schemas.openxmlformats.org/drawingml/2006/picture">
                   <pic:nvPicPr>
                     <pic:cNvPr id="0" name="viz_feature_importance.png"/>
                     <pic:cNvPicPr/>
                   </pic:nvPicPr>
                   <pic:blipFill>
-                    <a:blip r:embed="rId10"/>
+                    <a:blip r:embed="rId7"/>
                     <a:stretch>
                       <a:fillRect/>
                     </a:stretch>
@@ -910,7 +997,9 @@
                       <a:off x="0" y="0"/>
                       <a:ext cx="5029200" cy="2794000"/>
                     </a:xfrm>
-                    <a:prstGeom prst="rect"/>
+                    <a:prstGeom prst="rect">
+                      <a:avLst/>
+                    </a:prstGeom>
                   </pic:spPr>
                 </pic:pic>
               </a:graphicData>
@@ -938,11 +1027,18 @@
       </w:pPr>
       <w:r>
         <w:rPr>
-          <w:b/>
           <w:color w:val="1A5276"/>
           <w:sz w:val="30"/>
         </w:rPr>
-        <w:t>5. Strategic Recommendations for Decision-Makers &amp; Governments</w:t>
+        <w:lastRenderedPageBreak/>
+        <w:t>5. Strategic Recommendatio</w:t>
+      </w:r>
+      <w:r>
+        <w:rPr>
+          <w:color w:val="1A5276"/>
+          <w:sz w:val="30"/>
+        </w:rPr>
+        <w:t>ns for Decision-Makers &amp; Governments</w:t>
       </w:r>
     </w:p>
     <w:p>
@@ -961,7 +1057,10 @@
         <w:t xml:space="preserve">1. Shift from Pure GDP Maximization to Inclusive Prosperity: </w:t>
       </w:r>
       <w:r>
-        <w:t>While GDP per capita is the strongest baseline driver, diminishing marginal returns occur beyond upper-middle-income thresholds. National policy must pivot toward equitable distribution, healthcare accessibility, and community infrastructure to yield measurable happiness gains.</w:t>
+        <w:t>While GDP per capita is the strongest baseline driver, diminishing marginal returns occur beyond upper-middle-income thresholds. National policy must pivot toward equitable distribution, healthca</w:t>
+      </w:r>
+      <w:r>
+        <w:t>re accessibility, and community infrastructure to yield measurable happiness gains.</w:t>
       </w:r>
     </w:p>
     <w:p>
@@ -975,7 +1074,10 @@
         <w:t xml:space="preserve">2. Strengthen Institutional Anti-Corruption Frameworks: </w:t>
       </w:r>
       <w:r>
-        <w:t>Government Trust and Low Corruption exhibit the highest disparity ratio between top 10 and bottom 10 nations. Transparent judicial systems, open governance data, and meritocratic public administrations act as critical catalysts for civic satisfaction.</w:t>
+        <w:t>Government Trust and Low Corruption exhibit the highest disparity ratio between top 10 and bottom 10 nations. Transp</w:t>
+      </w:r>
+      <w:r>
+        <w:t>arent judicial systems, open governance data, and meritocratic public administrations act as critical catalysts for civic satisfaction.</w:t>
       </w:r>
     </w:p>
     <w:p>
@@ -989,7 +1091,10 @@
         <w:t xml:space="preserve">3. Formalize Social Safety Nets &amp; Mental Health Support: </w:t>
       </w:r>
       <w:r>
-        <w:t>Family and social cohesion account for over 22% of predictive model weight. Governments should invest in family leave policies, eldercare infrastructure, and community-level mental wellness programs to buffer against macroeconomic volatility.</w:t>
+        <w:t>Family and social cohesion account for over 22% of predictive m</w:t>
+      </w:r>
+      <w:r>
+        <w:t>odel weight. Governments should invest in family leave policies, eldercare infrastructure, and community-level mental wellness programs to buffer against macroeconomic volatility.</w:t>
       </w:r>
     </w:p>
     <w:p>
@@ -1003,7 +1108,10 @@
         <w:t xml:space="preserve">4. Protect Democratic Freedoms and Civic Autonomy: </w:t>
       </w:r>
       <w:r>
-        <w:t>The freedom to make life choices correlates strongly with subjective well-being across all income quartiles. Protecting civic freedoms, entrepreneurship ease, and individual rights directly elevates national morale.</w:t>
+        <w:t xml:space="preserve">The freedom to make life </w:t>
+      </w:r>
+      <w:r>
+        <w:t>choices correlates strongly with subjective well-being across all income quartiles. Protecting civic freedoms, entrepreneurship ease, and individual rights directly elevates national morale.</w:t>
       </w:r>
     </w:p>
     <w:p>
@@ -1013,7 +1121,6 @@
       </w:pPr>
       <w:r>
         <w:rPr>
-          <w:b/>
           <w:color w:val="1A5276"/>
           <w:sz w:val="30"/>
         </w:rPr>
@@ -1022,14 +1129,27 @@
     </w:p>
     <w:p>
       <w:r>
-        <w:t>The implications of national well-being extend directly into economic productivity, human capital retention, and corporate performance:</w:t>
+        <w:t>The implications</w:t>
+      </w:r>
+      <w:r>
+        <w:t xml:space="preserve"> of national well-being extend directly into economic productivity, human capital retention, and corporate performance:</w:t>
       </w:r>
     </w:p>
     <w:p>
       <w:r>
-        <w:t>• Labor Productivity &amp; Innovation: Nations with higher subjective well-being consistently exhibit higher workforce engagement, lower absenteeism, and superior rates of technological innovation.</w:t>
+        <w:t>• Labor Productivity &amp; Innovation: Nations with higher subjective well-being consistently exhibit higher workforce engagement, lower abs</w:t>
+      </w:r>
+      <w:r>
+        <w:t>enteeism, and superior rates of technological innovation.</w:t>
+      </w:r>
+      <w:r>
         <w:br/>
-        <w:t>• Foreign Direct Investment (FDI) Attractiveness: International corporations increasingly factor quality-of-life indices, social stability, and institutional transparency into long-term capital allocation decisions.</w:t>
+        <w:t>• Foreign Direct Investment (FDI) Attractiveness: International corporations increasingly factor quality-of-life indices, social stability, and institutional transparency into long-term capital allo</w:t>
+      </w:r>
+      <w:r>
+        <w:t>cation decisions.</w:t>
+      </w:r>
+      <w:r>
         <w:br/>
         <w:t>• Brain Drain Mitigation: High-trust, high-freedom societies retain domestic skilled talent and attract global human capital, generating positive compounding feedback loops.</w:t>
       </w:r>
@@ -1041,7 +1161,6 @@
       </w:pPr>
       <w:r>
         <w:rPr>
-          <w:b/>
           <w:color w:val="1A5276"/>
           <w:sz w:val="30"/>
         </w:rPr>
@@ -1050,7 +1169,10 @@
     </w:p>
     <w:p>
       <w:r>
-        <w:t>While the project delivers robust predictive and statistical results, several analytical constraints provide avenues for future extension:</w:t>
+        <w:t>While the project deliv</w:t>
+      </w:r>
+      <w:r>
+        <w:t>ers robust predictive and statistical results, several analytical constraints provide avenues for future extension:</w:t>
       </w:r>
     </w:p>
     <w:p>
@@ -1064,7 +1186,10 @@
         <w:t xml:space="preserve">Schema Concatenation Harmonization: </w:t>
       </w:r>
       <w:r>
-        <w:t>Future iterations should rectify historical column header variations in 2017–2022 to expand the fully-supervised modeling dataset from 315 rows to over 1,200 observations.</w:t>
+        <w:t>Future iterations should rectify historical column header variations in 2017–2022 to expand the fully-su</w:t>
+      </w:r>
+      <w:r>
+        <w:t>pervised modeling dataset from 315 rows to over 1,200 observations.</w:t>
       </w:r>
     </w:p>
     <w:p>
@@ -1075,10 +1200,14 @@
         <w:rPr>
           <w:b/>
         </w:rPr>
+        <w:lastRenderedPageBreak/>
         <w:t xml:space="preserve">Granular Sub-National &amp; Inequality Data: </w:t>
       </w:r>
       <w:r>
-        <w:t>National averages can mask severe internal socio-economic and regional disparities; integrating regional Gini coefficients and urban-versus-rural indices would refine predictive precision.</w:t>
+        <w:t>National averages can mask severe internal socio-economic and regional disparities; integrating regional Gini coefficients and urban-versus-rural i</w:t>
+      </w:r>
+      <w:r>
+        <w:t>ndices would refine predictive precision.</w:t>
       </w:r>
     </w:p>
     <w:p>
@@ -1092,7 +1221,10 @@
         <w:t xml:space="preserve">Advanced Time-Series &amp; Econometric Modeling: </w:t>
       </w:r>
       <w:r>
-        <w:t>Incorporating panel data econometric techniques (Fixed Effects / Random Effects) and deep learning sequential models to study macro-shock resilience (e.g., global recessions, pandemics).</w:t>
+        <w:t>Incorporating panel data econometric techniques (Fixed Effects / Random Effects) and deep learning sequential models to study macro-shock resilience (e.g., global recess</w:t>
+      </w:r>
+      <w:r>
+        <w:t>ions, pandemics).</w:t>
       </w:r>
     </w:p>
     <w:p>
@@ -1102,7 +1234,6 @@
       </w:pPr>
       <w:r>
         <w:rPr>
-          <w:b/>
           <w:color w:val="1A5276"/>
           <w:sz w:val="30"/>
         </w:rPr>
@@ -1111,12 +1242,21 @@
     </w:p>
     <w:p>
       <w:r>
-        <w:t>The 5-week World Happiness Report project successfully bridges quantitative data science methodologies—from exploratory auditing to predictive machine learning—with real-world socio-economic strategy. The findings conclusively demonstrate that sustainable national well-being requires a balanced tripartite strategy: sustainable economic output, accessible social safety architectures, and uncompromising institutional integrity.</w:t>
+        <w:t>The 5-week World Happiness Report project successfully bridges quantitative data science methodologies—from exploratory auditing to predictive machine learning—with real-world socio-economic strategy. The findings conclusive</w:t>
+      </w:r>
+      <w:r>
+        <w:t>ly demonstrate that sustainable national well-being requires a balanced tripartite strategy: sustainable economic output, accessible social safety architectures, and uncompromising institutional integrity.</w:t>
       </w:r>
     </w:p>
     <w:sectPr>
       <w:pgSz w:w="12240" w:h="15840"/>
       <w:pgMar w:top="1440" w:right="1440" w:bottom="1440" w:left="1440" w:header="720" w:footer="720" w:gutter="0"/>
+      <w:pgBorders w:offsetFrom="page">
+        <w:top w:val="double" w:sz="4" w:space="24" w:color="auto"/>
+        <w:left w:val="double" w:sz="4" w:space="24" w:color="auto"/>
+        <w:bottom w:val="double" w:sz="4" w:space="24" w:color="auto"/>
+        <w:right w:val="double" w:sz="4" w:space="24" w:color="auto"/>
+      </w:pgBorders>
       <w:cols w:space="720"/>
       <w:docGrid w:linePitch="360"/>
     </w:sectPr>
@@ -1125,7 +1265,7 @@
 </file>
 
 <file path=word/numbering.xml><?xml version="1.0" encoding="utf-8"?>
-<w:numbering xmlns:wpc="http://schemas.microsoft.com/office/word/2010/wordprocessingCanvas" xmlns:mo="http://schemas.microsoft.com/office/mac/office/2008/main" xmlns:mc="http://schemas.openxmlformats.org/markup-compatibility/2006" xmlns:mv="urn:schemas-microsoft-com:mac:vml" xmlns:o="urn:schemas-microsoft-com:office:office" xmlns:r="http://schemas.openxmlformats.org/officeDocument/2006/relationships" xmlns:m="http://schemas.openxmlformats.org/officeDocument/2006/math" xmlns:v="urn:schemas-microsoft-com:vml" xmlns:wp14="http://schemas.microsoft.com/office/word/2010/wordprocessingDrawing" xmlns:wp="http://schemas.openxmlformats.org/drawingml/2006/wordprocessingDrawing" xmlns:w10="urn:schemas-microsoft-com:office:word" xmlns:w="http://schemas.openxmlformats.org/wordprocessingml/2006/main" xmlns:w14="http://schemas.microsoft.com/office/word/2010/wordml" xmlns:wpg="http://schemas.microsoft.com/office/word/2010/wordprocessingGroup" xmlns:wpi="http://schemas.microsoft.com/office/word/2010/wordprocessingInk" xmlns:wne="http://schemas.microsoft.com/office/word/2006/wordml" xmlns:wps="http://schemas.microsoft.com/office/word/2010/wordprocessingShape" mc:Ignorable="w14 wp14">
+<w:numbering xmlns:ve="http://schemas.openxmlformats.org/markup-compatibility/2006" xmlns:o="urn:schemas-microsoft-com:office:office" xmlns:r="http://schemas.openxmlformats.org/officeDocument/2006/relationships" xmlns:m="http://schemas.openxmlformats.org/officeDocument/2006/math" xmlns:v="urn:schemas-microsoft-com:vml" xmlns:wp="http://schemas.openxmlformats.org/drawingml/2006/wordprocessingDrawing" xmlns:w10="urn:schemas-microsoft-com:office:word" xmlns:w="http://schemas.openxmlformats.org/wordprocessingml/2006/main" xmlns:wne="http://schemas.microsoft.com/office/word/2006/wordml">
   <w:abstractNum w:abstractNumId="0">
     <w:nsid w:val="FFFFFF7C"/>
     <w:multiLevelType w:val="singleLevel"/>
@@ -1328,7 +1468,7 @@
 </file>
 
 <file path=word/styles.xml><?xml version="1.0" encoding="utf-8"?>
-<w:styles xmlns:mc="http://schemas.openxmlformats.org/markup-compatibility/2006" xmlns:r="http://schemas.openxmlformats.org/officeDocument/2006/relationships" xmlns:w="http://schemas.openxmlformats.org/wordprocessingml/2006/main" xmlns:w14="http://schemas.microsoft.com/office/word/2010/wordml" mc:Ignorable="w14">
+<w:styles xmlns:r="http://schemas.openxmlformats.org/officeDocument/2006/relationships" xmlns:w="http://schemas.openxmlformats.org/wordprocessingml/2006/main">
   <w:docDefaults>
     <w:rPrDefault>
       <w:rPr>
@@ -1344,7 +1484,7 @@
       </w:pPr>
     </w:pPrDefault>
   </w:docDefaults>
-  <w:latentStyles w:defLockedState="0" w:defUIPriority="99" w:defSemiHidden="1" w:defUnhideWhenUsed="1" w:defQFormat="0" w:count="276">
+  <w:latentStyles w:defLockedState="0" w:defUIPriority="99" w:defSemiHidden="1" w:defUnhideWhenUsed="1" w:defQFormat="0" w:count="267">
     <w:lsdException w:name="Normal" w:semiHidden="0" w:uiPriority="0" w:unhideWhenUsed="0" w:qFormat="1"/>
     <w:lsdException w:name="heading 1" w:semiHidden="0" w:uiPriority="9" w:unhideWhenUsed="0" w:qFormat="1"/>
     <w:lsdException w:name="heading 2" w:uiPriority="9" w:qFormat="1"/>
@@ -1488,50 +1628,6 @@
     <w:qFormat/>
     <w:rsid w:val="00FC693F"/>
   </w:style>
-  <w:style w:type="paragraph" w:styleId="Header">
-    <w:name w:val="header"/>
-    <w:basedOn w:val="Normal"/>
-    <w:link w:val="HeaderChar"/>
-    <w:uiPriority w:val="99"/>
-    <w:unhideWhenUsed/>
-    <w:rsid w:val="00E618BF"/>
-    <w:pPr>
-      <w:tabs>
-        <w:tab w:val="center" w:pos="4680"/>
-        <w:tab w:val="right" w:pos="9360"/>
-      </w:tabs>
-      <w:spacing w:after="0" w:line="240" w:lineRule="auto"/>
-    </w:pPr>
-  </w:style>
-  <w:style w:type="character" w:customStyle="1" w:styleId="HeaderChar">
-    <w:name w:val="Header Char"/>
-    <w:basedOn w:val="DefaultParagraphFont"/>
-    <w:link w:val="Header"/>
-    <w:uiPriority w:val="99"/>
-    <w:rsid w:val="00E618BF"/>
-  </w:style>
-  <w:style w:type="paragraph" w:styleId="Footer">
-    <w:name w:val="footer"/>
-    <w:basedOn w:val="Normal"/>
-    <w:link w:val="FooterChar"/>
-    <w:uiPriority w:val="99"/>
-    <w:unhideWhenUsed/>
-    <w:rsid w:val="00E618BF"/>
-    <w:pPr>
-      <w:tabs>
-        <w:tab w:val="center" w:pos="4680"/>
-        <w:tab w:val="right" w:pos="9360"/>
-      </w:tabs>
-      <w:spacing w:after="0" w:line="240" w:lineRule="auto"/>
-    </w:pPr>
-  </w:style>
-  <w:style w:type="character" w:customStyle="1" w:styleId="FooterChar">
-    <w:name w:val="Footer Char"/>
-    <w:basedOn w:val="DefaultParagraphFont"/>
-    <w:link w:val="Footer"/>
-    <w:uiPriority w:val="99"/>
-    <w:rsid w:val="00E618BF"/>
-  </w:style>
   <w:style w:type="paragraph" w:styleId="Heading1">
     <w:name w:val="heading 1"/>
     <w:basedOn w:val="Normal"/>
@@ -1752,6 +1848,7 @@
     <w:uiPriority w:val="99"/>
     <w:semiHidden/>
     <w:unhideWhenUsed/>
+    <w:qFormat/>
     <w:tblPr>
       <w:tblInd w:w="0" w:type="dxa"/>
       <w:tblCellMar>
@@ -1767,6 +1864,50 @@
     <w:uiPriority w:val="99"/>
     <w:semiHidden/>
     <w:unhideWhenUsed/>
+  </w:style>
+  <w:style w:type="paragraph" w:styleId="Header">
+    <w:name w:val="header"/>
+    <w:basedOn w:val="Normal"/>
+    <w:link w:val="HeaderChar"/>
+    <w:uiPriority w:val="99"/>
+    <w:unhideWhenUsed/>
+    <w:rsid w:val="00E618BF"/>
+    <w:pPr>
+      <w:tabs>
+        <w:tab w:val="center" w:pos="4680"/>
+        <w:tab w:val="right" w:pos="9360"/>
+      </w:tabs>
+      <w:spacing w:after="0" w:line="240" w:lineRule="auto"/>
+    </w:pPr>
+  </w:style>
+  <w:style w:type="character" w:customStyle="1" w:styleId="HeaderChar">
+    <w:name w:val="Header Char"/>
+    <w:basedOn w:val="DefaultParagraphFont"/>
+    <w:link w:val="Header"/>
+    <w:uiPriority w:val="99"/>
+    <w:rsid w:val="00E618BF"/>
+  </w:style>
+  <w:style w:type="paragraph" w:styleId="Footer">
+    <w:name w:val="footer"/>
+    <w:basedOn w:val="Normal"/>
+    <w:link w:val="FooterChar"/>
+    <w:uiPriority w:val="99"/>
+    <w:unhideWhenUsed/>
+    <w:rsid w:val="00E618BF"/>
+    <w:pPr>
+      <w:tabs>
+        <w:tab w:val="center" w:pos="4680"/>
+        <w:tab w:val="right" w:pos="9360"/>
+      </w:tabs>
+      <w:spacing w:after="0" w:line="240" w:lineRule="auto"/>
+    </w:pPr>
+  </w:style>
+  <w:style w:type="character" w:customStyle="1" w:styleId="FooterChar">
+    <w:name w:val="Footer Char"/>
+    <w:basedOn w:val="DefaultParagraphFont"/>
+    <w:link w:val="Footer"/>
+    <w:uiPriority w:val="99"/>
+    <w:rsid w:val="00E618BF"/>
   </w:style>
   <w:style w:type="paragraph" w:styleId="NoSpacing">
     <w:name w:val="No Spacing"/>
@@ -13169,6 +13310,36 @@
         <w:shd w:val="clear" w:color="auto" w:fill="FBCAA2" w:themeFill="accent6" w:themeFillTint="7F"/>
       </w:tcPr>
     </w:tblStylePr>
+  </w:style>
+  <w:style w:type="paragraph" w:styleId="BalloonText">
+    <w:name w:val="Balloon Text"/>
+    <w:basedOn w:val="Normal"/>
+    <w:link w:val="BalloonTextChar"/>
+    <w:uiPriority w:val="99"/>
+    <w:semiHidden/>
+    <w:unhideWhenUsed/>
+    <w:rsid w:val="00BB7BFC"/>
+    <w:pPr>
+      <w:spacing w:after="0" w:line="240" w:lineRule="auto"/>
+    </w:pPr>
+    <w:rPr>
+      <w:rFonts w:ascii="Tahoma" w:hAnsi="Tahoma" w:cs="Tahoma"/>
+      <w:sz w:val="16"/>
+      <w:szCs w:val="16"/>
+    </w:rPr>
+  </w:style>
+  <w:style w:type="character" w:customStyle="1" w:styleId="BalloonTextChar">
+    <w:name w:val="Balloon Text Char"/>
+    <w:basedOn w:val="DefaultParagraphFont"/>
+    <w:link w:val="BalloonText"/>
+    <w:uiPriority w:val="99"/>
+    <w:semiHidden/>
+    <w:rsid w:val="00BB7BFC"/>
+    <w:rPr>
+      <w:rFonts w:ascii="Tahoma" w:hAnsi="Tahoma" w:cs="Tahoma"/>
+      <w:sz w:val="16"/>
+      <w:szCs w:val="16"/>
+    </w:rPr>
   </w:style>
 </w:styles>
 </file>

</xml_diff>